<commit_message>
fix(docx): agregar placeholders <<UNSPSC>> y <<DESCRIPCIÓN>> a estudios_previos.docx
El template no contenía los placeholders, por lo que el código
UNSPSC y su descripción nunca se insertaban en el documento.
</commit_message>
<xml_diff>
--- a/backend/app/templates/estudios_previos.docx
+++ b/backend/app/templates/estudios_previos.docx
@@ -3421,7 +3421,7 @@
                 <w:bCs/>
                 <w:color w:val="000000"/>
               </w:rPr>
-              <w:t>UNSPSC</w:t>
+              <w:t>UNSPSC: &lt;&lt;UNSPSC&gt;&gt;</w:t>
             </w:r>
           </w:p>
           <w:p>
@@ -3567,6 +3567,11 @@
                 <w:shd w:val="clear" w:color="auto" w:fill="D0CECE"/>
               </w:rPr>
             </w:pPr>
+          </w:p>
+          <w:p>
+            <w:r>
+              <w:t>&lt;&lt;DESCRIPCIÓN&gt;&gt;</w:t>
+            </w:r>
           </w:p>
         </w:tc>
       </w:tr>

</xml_diff>

<commit_message>
fix(docx): sección 10 estudios previos solo muestra la etiqueta UNSPSC
Sin el código ni la descripción en línea, solo el texto
'Código de las Naciones Unidas Productos y Servicios
Estándar – UNSPSC' como en el original.
</commit_message>
<xml_diff>
--- a/backend/app/templates/estudios_previos.docx
+++ b/backend/app/templates/estudios_previos.docx
@@ -3421,7 +3421,7 @@
                 <w:bCs/>
                 <w:color w:val="000000"/>
               </w:rPr>
-              <w:t>UNSPSC: &lt;&lt;UNSPSC&gt;&gt;</w:t>
+              <w:t>UNSPSC</w:t>
             </w:r>
           </w:p>
           <w:p>
@@ -3567,11 +3567,6 @@
                 <w:shd w:val="clear" w:color="auto" w:fill="D0CECE"/>
               </w:rPr>
             </w:pPr>
-          </w:p>
-          <w:p>
-            <w:r>
-              <w:t>&lt;&lt;DESCRIPCIÓN&gt;&gt;</w:t>
-            </w:r>
           </w:p>
         </w:tc>
       </w:tr>

</xml_diff>